<commit_message>
Barranquita: memoria hidrologica completa (estructura de los CAR), FS 1.15 y norma CE.040
Co-Authored-By: Claude Opus 5.5 <noreply@anthropic.com>
Claude-Session: https://claude.ai/code/session_0142t8T16igb3VKxUPwnQPq6
</commit_message>
<xml_diff>
--- a/entregables_barranquita/MEMORIA_DESCRIPTIVA_DRENAJE_PLUVIAL_IE0590_BARRANQUITA.docx
+++ b/entregables_barranquita/MEMORIA_DESCRIPTIVA_DRENAJE_PLUVIAL_IE0590_BARRANQUITA.docx
@@ -749,7 +749,7 @@
         <w:t xml:space="preserve">Caudales: </w:t>
       </w:r>
       <w:r>
-        <w:t>método racional con coeficiente de escorrentía ponderado 0.57.</w:t>
+        <w:t>método racional con coeficiente de escorrentía ponderado 0.57 y factor de seguridad de 1.15.</w:t>
       </w:r>
     </w:p>
     <w:p>
@@ -4625,7 +4625,7 @@
         <w:jc w:val="both"/>
       </w:pPr>
       <w:r>
-        <w:t>Reglamento Nacional de Edificaciones: Norma OS.060 Drenaje Pluvial Urbano; Norma E.060 Concreto Armado; Norma IS.010 Instalaciones Sanitarias.</w:t>
+        <w:t>Reglamento Nacional de Edificaciones: Norma Técnica CE.040 Drenaje Pluvial (R.M. N° 126-2021-VIVIENDA); Norma E.060 Concreto Armado; Norma IS.010 Instalaciones Sanitarias para Edificaciones.</w:t>
       </w:r>
     </w:p>
     <w:p>

</xml_diff>